<commit_message>
add Task and Allocations of roles to Report
</commit_message>
<xml_diff>
--- a/Звіт.docx
+++ b/Звіт.docx
@@ -5,6 +5,7 @@
     <w:p>
       <w:pPr>
         <w:spacing w:before="240" w:after="0" w:line="240" w:lineRule="auto"/>
+        <w:ind w:left="-426" w:firstLine="426"/>
         <w:jc w:val="center"/>
         <w:rPr>
           <w:rFonts w:ascii="Times New Roman" w:hAnsi="Times New Roman" w:cs="Times New Roman"/>
@@ -24,6 +25,7 @@
     <w:p>
       <w:pPr>
         <w:spacing w:before="240" w:after="0" w:line="240" w:lineRule="auto"/>
+        <w:ind w:left="-426" w:firstLine="426"/>
         <w:jc w:val="center"/>
         <w:rPr>
           <w:rFonts w:ascii="Times New Roman" w:hAnsi="Times New Roman" w:cs="Times New Roman"/>
@@ -43,6 +45,7 @@
     <w:p>
       <w:pPr>
         <w:spacing w:before="240" w:after="0" w:line="240" w:lineRule="auto"/>
+        <w:ind w:left="-426" w:firstLine="426"/>
         <w:jc w:val="center"/>
         <w:rPr>
           <w:rFonts w:ascii="Times New Roman" w:hAnsi="Times New Roman" w:cs="Times New Roman"/>
@@ -62,6 +65,7 @@
     <w:p>
       <w:pPr>
         <w:spacing w:after="0" w:line="240" w:lineRule="auto"/>
+        <w:ind w:left="-426" w:firstLine="426"/>
         <w:jc w:val="center"/>
         <w:rPr>
           <w:rFonts w:ascii="Times New Roman" w:hAnsi="Times New Roman" w:cs="Times New Roman"/>
@@ -73,6 +77,7 @@
     <w:p>
       <w:pPr>
         <w:spacing w:after="0" w:line="240" w:lineRule="auto"/>
+        <w:ind w:left="-426" w:firstLine="426"/>
         <w:jc w:val="center"/>
         <w:rPr>
           <w:rFonts w:ascii="Times New Roman" w:hAnsi="Times New Roman" w:cs="Times New Roman"/>
@@ -84,6 +89,7 @@
     <w:p>
       <w:pPr>
         <w:spacing w:after="0" w:line="240" w:lineRule="auto"/>
+        <w:ind w:left="-426" w:firstLine="426"/>
         <w:jc w:val="center"/>
         <w:rPr>
           <w:rFonts w:ascii="Times New Roman" w:hAnsi="Times New Roman" w:cs="Times New Roman"/>
@@ -113,7 +119,7 @@
                     </pic:cNvPicPr>
                   </pic:nvPicPr>
                   <pic:blipFill>
-                    <a:blip r:embed="rId5" cstate="print">
+                    <a:blip r:embed="rId6" cstate="print">
                       <a:extLst>
                         <a:ext uri="{28A0092B-C50C-407E-A947-70E740481C1C}">
                           <a14:useLocalDpi xmlns:a14="http://schemas.microsoft.com/office/drawing/2010/main" val="0"/>
@@ -148,6 +154,7 @@
     <w:p>
       <w:pPr>
         <w:spacing w:after="0" w:line="240" w:lineRule="auto"/>
+        <w:ind w:left="-426" w:firstLine="426"/>
         <w:jc w:val="center"/>
         <w:rPr>
           <w:rFonts w:ascii="Times New Roman" w:hAnsi="Times New Roman" w:cs="Times New Roman"/>
@@ -159,6 +166,7 @@
     <w:p>
       <w:pPr>
         <w:spacing w:after="0" w:line="240" w:lineRule="auto"/>
+        <w:ind w:left="-426" w:firstLine="426"/>
         <w:jc w:val="center"/>
         <w:rPr>
           <w:rFonts w:ascii="Times New Roman" w:hAnsi="Times New Roman" w:cs="Times New Roman"/>
@@ -170,6 +178,7 @@
     <w:p>
       <w:pPr>
         <w:spacing w:after="0" w:line="240" w:lineRule="auto"/>
+        <w:ind w:left="-426" w:firstLine="426"/>
         <w:jc w:val="center"/>
         <w:rPr>
           <w:rFonts w:ascii="Times New Roman" w:hAnsi="Times New Roman" w:cs="Times New Roman"/>
@@ -181,6 +190,7 @@
     <w:p>
       <w:pPr>
         <w:spacing w:after="0" w:line="240" w:lineRule="auto"/>
+        <w:ind w:left="-426" w:firstLine="426"/>
         <w:jc w:val="center"/>
         <w:rPr>
           <w:rFonts w:ascii="Times New Roman" w:hAnsi="Times New Roman" w:cs="Times New Roman"/>
@@ -204,6 +214,7 @@
     <w:p>
       <w:pPr>
         <w:spacing w:after="0" w:line="240" w:lineRule="auto"/>
+        <w:ind w:left="-426" w:firstLine="426"/>
         <w:rPr>
           <w:rFonts w:ascii="Times New Roman" w:hAnsi="Times New Roman" w:cs="Times New Roman"/>
           <w:b/>
@@ -216,6 +227,7 @@
     <w:p>
       <w:pPr>
         <w:spacing w:after="0" w:line="240" w:lineRule="auto"/>
+        <w:ind w:left="-426" w:firstLine="426"/>
         <w:jc w:val="center"/>
         <w:rPr>
           <w:rFonts w:ascii="Times New Roman" w:hAnsi="Times New Roman" w:cs="Times New Roman"/>
@@ -244,13 +256,9 @@
           <w:szCs w:val="28"/>
           <w:lang w:val="en-US"/>
         </w:rPr>
-        <w:t>DigiUni Registry</w:t>
-      </w:r>
-    </w:p>
-    <w:p>
-      <w:pPr>
-        <w:spacing w:after="0" w:line="240" w:lineRule="auto"/>
-        <w:jc w:val="center"/>
+        <w:t>DigiUni</w:t>
+      </w:r>
+      <w:r>
         <w:rPr>
           <w:rFonts w:ascii="Times New Roman" w:hAnsi="Times New Roman" w:cs="Times New Roman"/>
           <w:b/>
@@ -258,24 +266,24 @@
           <w:sz w:val="28"/>
           <w:szCs w:val="28"/>
         </w:rPr>
-      </w:pPr>
-    </w:p>
-    <w:p>
-      <w:pPr>
-        <w:spacing w:after="0" w:line="240" w:lineRule="auto"/>
-        <w:jc w:val="center"/>
+        <w:t xml:space="preserve"> </w:t>
+      </w:r>
+      <w:r>
         <w:rPr>
           <w:rFonts w:ascii="Times New Roman" w:hAnsi="Times New Roman" w:cs="Times New Roman"/>
           <w:b/>
           <w:bCs/>
           <w:sz w:val="28"/>
           <w:szCs w:val="28"/>
-        </w:rPr>
-      </w:pPr>
-    </w:p>
-    <w:p>
-      <w:pPr>
-        <w:spacing w:after="0" w:line="240" w:lineRule="auto"/>
+          <w:lang w:val="en-US"/>
+        </w:rPr>
+        <w:t>Registry</w:t>
+      </w:r>
+    </w:p>
+    <w:p>
+      <w:pPr>
+        <w:spacing w:after="0" w:line="240" w:lineRule="auto"/>
+        <w:ind w:left="-426" w:firstLine="426"/>
         <w:jc w:val="center"/>
         <w:rPr>
           <w:rFonts w:ascii="Times New Roman" w:hAnsi="Times New Roman" w:cs="Times New Roman"/>
@@ -285,7 +293,12 @@
           <w:szCs w:val="28"/>
         </w:rPr>
       </w:pPr>
-      <w:r>
+    </w:p>
+    <w:p>
+      <w:pPr>
+        <w:spacing w:after="0" w:line="240" w:lineRule="auto"/>
+        <w:ind w:left="-426" w:firstLine="426"/>
+        <w:jc w:val="center"/>
         <w:rPr>
           <w:rFonts w:ascii="Times New Roman" w:hAnsi="Times New Roman" w:cs="Times New Roman"/>
           <w:b/>
@@ -293,12 +306,12 @@
           <w:sz w:val="28"/>
           <w:szCs w:val="28"/>
         </w:rPr>
-        <w:t>ЗВІТ</w:t>
-      </w:r>
-    </w:p>
-    <w:p>
-      <w:pPr>
-        <w:spacing w:after="0" w:line="240" w:lineRule="auto"/>
+      </w:pPr>
+    </w:p>
+    <w:p>
+      <w:pPr>
+        <w:spacing w:after="0" w:line="240" w:lineRule="auto"/>
+        <w:ind w:left="-426" w:firstLine="426"/>
         <w:jc w:val="center"/>
         <w:rPr>
           <w:rFonts w:ascii="Times New Roman" w:hAnsi="Times New Roman" w:cs="Times New Roman"/>
@@ -308,11 +321,7 @@
           <w:szCs w:val="28"/>
         </w:rPr>
       </w:pPr>
-    </w:p>
-    <w:p>
-      <w:pPr>
-        <w:spacing w:after="0" w:line="240" w:lineRule="auto"/>
-        <w:jc w:val="center"/>
+      <w:r>
         <w:rPr>
           <w:rFonts w:ascii="Times New Roman" w:hAnsi="Times New Roman" w:cs="Times New Roman"/>
           <w:b/>
@@ -320,12 +329,41 @@
           <w:sz w:val="28"/>
           <w:szCs w:val="28"/>
         </w:rPr>
-      </w:pPr>
-    </w:p>
-    <w:p>
-      <w:pPr>
-        <w:spacing w:after="0" w:line="240" w:lineRule="auto"/>
-        <w:ind w:firstLine="5670"/>
+        <w:t>ЗВІТ</w:t>
+      </w:r>
+    </w:p>
+    <w:p>
+      <w:pPr>
+        <w:spacing w:after="0" w:line="240" w:lineRule="auto"/>
+        <w:ind w:left="-426" w:firstLine="426"/>
+        <w:jc w:val="center"/>
+        <w:rPr>
+          <w:rFonts w:ascii="Times New Roman" w:hAnsi="Times New Roman" w:cs="Times New Roman"/>
+          <w:b/>
+          <w:bCs/>
+          <w:sz w:val="28"/>
+          <w:szCs w:val="28"/>
+        </w:rPr>
+      </w:pPr>
+    </w:p>
+    <w:p>
+      <w:pPr>
+        <w:spacing w:after="0" w:line="240" w:lineRule="auto"/>
+        <w:ind w:left="-426" w:firstLine="426"/>
+        <w:jc w:val="center"/>
+        <w:rPr>
+          <w:rFonts w:ascii="Times New Roman" w:hAnsi="Times New Roman" w:cs="Times New Roman"/>
+          <w:b/>
+          <w:bCs/>
+          <w:sz w:val="28"/>
+          <w:szCs w:val="28"/>
+        </w:rPr>
+      </w:pPr>
+    </w:p>
+    <w:p>
+      <w:pPr>
+        <w:spacing w:after="0" w:line="240" w:lineRule="auto"/>
+        <w:ind w:left="-426" w:firstLine="426"/>
         <w:jc w:val="both"/>
         <w:rPr>
           <w:rFonts w:ascii="Times New Roman" w:hAnsi="Times New Roman" w:cs="Times New Roman"/>
@@ -347,7 +385,7 @@
     <w:p>
       <w:pPr>
         <w:spacing w:after="0" w:line="240" w:lineRule="auto"/>
-        <w:ind w:firstLine="5670"/>
+        <w:ind w:left="-426" w:firstLine="426"/>
         <w:jc w:val="both"/>
         <w:rPr>
           <w:rFonts w:ascii="Times New Roman" w:hAnsi="Times New Roman" w:cs="Times New Roman"/>
@@ -357,7 +395,7 @@
     <w:p>
       <w:pPr>
         <w:spacing w:after="0" w:line="240" w:lineRule="auto"/>
-        <w:ind w:firstLine="5670"/>
+        <w:ind w:left="-426" w:firstLine="426"/>
         <w:jc w:val="both"/>
         <w:rPr>
           <w:rFonts w:ascii="Times New Roman" w:hAnsi="Times New Roman" w:cs="Times New Roman"/>
@@ -373,7 +411,7 @@
     <w:p>
       <w:pPr>
         <w:spacing w:after="0" w:line="240" w:lineRule="auto"/>
-        <w:ind w:firstLine="5670"/>
+        <w:ind w:left="-426" w:firstLine="426"/>
         <w:jc w:val="both"/>
         <w:rPr>
           <w:rFonts w:ascii="Times New Roman" w:hAnsi="Times New Roman" w:cs="Times New Roman"/>
@@ -389,7 +427,7 @@
     <w:p>
       <w:pPr>
         <w:spacing w:after="0" w:line="240" w:lineRule="auto"/>
-        <w:ind w:firstLine="5670"/>
+        <w:ind w:left="-426" w:firstLine="426"/>
         <w:jc w:val="both"/>
         <w:rPr>
           <w:rFonts w:ascii="Times New Roman" w:hAnsi="Times New Roman" w:cs="Times New Roman"/>
@@ -405,7 +443,7 @@
     <w:p>
       <w:pPr>
         <w:spacing w:after="0" w:line="240" w:lineRule="auto"/>
-        <w:ind w:firstLine="5670"/>
+        <w:ind w:left="-426" w:firstLine="426"/>
         <w:jc w:val="both"/>
         <w:rPr>
           <w:rFonts w:ascii="Times New Roman" w:hAnsi="Times New Roman" w:cs="Times New Roman"/>
@@ -421,7 +459,7 @@
     <w:p>
       <w:pPr>
         <w:spacing w:after="0" w:line="240" w:lineRule="auto"/>
-        <w:ind w:firstLine="5670"/>
+        <w:ind w:left="-426" w:firstLine="426"/>
         <w:jc w:val="both"/>
         <w:rPr>
           <w:rFonts w:ascii="Times New Roman" w:hAnsi="Times New Roman" w:cs="Times New Roman"/>
@@ -437,7 +475,7 @@
     <w:p>
       <w:pPr>
         <w:spacing w:after="0" w:line="240" w:lineRule="auto"/>
-        <w:ind w:firstLine="5670"/>
+        <w:ind w:left="-426" w:firstLine="426"/>
         <w:jc w:val="both"/>
         <w:rPr>
           <w:rFonts w:ascii="Times New Roman" w:hAnsi="Times New Roman" w:cs="Times New Roman"/>
@@ -453,7 +491,7 @@
     <w:p>
       <w:pPr>
         <w:spacing w:after="0" w:line="240" w:lineRule="auto"/>
-        <w:ind w:firstLine="5670"/>
+        <w:ind w:left="-426" w:firstLine="426"/>
         <w:jc w:val="both"/>
         <w:rPr>
           <w:rFonts w:ascii="Times New Roman" w:hAnsi="Times New Roman" w:cs="Times New Roman"/>
@@ -463,7 +501,7 @@
     <w:p>
       <w:pPr>
         <w:spacing w:after="0" w:line="240" w:lineRule="auto"/>
-        <w:ind w:firstLine="5670"/>
+        <w:ind w:left="-426" w:firstLine="426"/>
         <w:jc w:val="both"/>
         <w:rPr>
           <w:rFonts w:ascii="Times New Roman" w:hAnsi="Times New Roman" w:cs="Times New Roman"/>
@@ -479,7 +517,7 @@
     <w:p>
       <w:pPr>
         <w:spacing w:after="0" w:line="240" w:lineRule="auto"/>
-        <w:ind w:firstLine="5670"/>
+        <w:ind w:left="-426" w:firstLine="426"/>
         <w:jc w:val="both"/>
         <w:rPr>
           <w:rFonts w:ascii="Times New Roman" w:hAnsi="Times New Roman" w:cs="Times New Roman"/>
@@ -495,7 +533,7 @@
     <w:p>
       <w:pPr>
         <w:spacing w:after="0" w:line="240" w:lineRule="auto"/>
-        <w:ind w:firstLine="5670"/>
+        <w:ind w:left="-426" w:firstLine="426"/>
         <w:jc w:val="both"/>
         <w:rPr>
           <w:rFonts w:ascii="Times New Roman" w:hAnsi="Times New Roman" w:cs="Times New Roman"/>
@@ -511,7 +549,7 @@
     <w:p>
       <w:pPr>
         <w:spacing w:after="0" w:line="240" w:lineRule="auto"/>
-        <w:ind w:firstLine="5670"/>
+        <w:ind w:left="-426" w:firstLine="426"/>
         <w:jc w:val="both"/>
         <w:rPr>
           <w:rFonts w:ascii="Times New Roman" w:hAnsi="Times New Roman" w:cs="Times New Roman"/>
@@ -527,7 +565,7 @@
     <w:p>
       <w:pPr>
         <w:spacing w:after="0" w:line="240" w:lineRule="auto"/>
-        <w:ind w:firstLine="5670"/>
+        <w:ind w:left="-426" w:firstLine="426"/>
         <w:jc w:val="both"/>
         <w:rPr>
           <w:rFonts w:ascii="Times New Roman" w:hAnsi="Times New Roman" w:cs="Times New Roman"/>
@@ -543,7 +581,7 @@
     <w:p>
       <w:pPr>
         <w:spacing w:after="0" w:line="240" w:lineRule="auto"/>
-        <w:ind w:firstLine="5670"/>
+        <w:ind w:left="-426" w:firstLine="426"/>
         <w:jc w:val="both"/>
         <w:rPr>
           <w:rFonts w:ascii="Times New Roman" w:hAnsi="Times New Roman" w:cs="Times New Roman"/>
@@ -553,19 +591,13 @@
         <w:rPr>
           <w:rFonts w:ascii="Times New Roman" w:hAnsi="Times New Roman" w:cs="Times New Roman"/>
         </w:rPr>
-        <w:t xml:space="preserve">забезпечення, гр. </w:t>
-      </w:r>
-      <w:r>
-        <w:rPr>
-          <w:rFonts w:ascii="Times New Roman" w:hAnsi="Times New Roman" w:cs="Times New Roman"/>
-        </w:rPr>
-        <w:t>3</w:t>
-      </w:r>
-    </w:p>
-    <w:p>
-      <w:pPr>
-        <w:spacing w:after="0" w:line="240" w:lineRule="auto"/>
-        <w:ind w:firstLine="5670"/>
+        <w:t>забезпечення, гр. 3</w:t>
+      </w:r>
+    </w:p>
+    <w:p>
+      <w:pPr>
+        <w:spacing w:after="0" w:line="240" w:lineRule="auto"/>
+        <w:ind w:left="-426" w:firstLine="426"/>
         <w:jc w:val="both"/>
         <w:rPr>
           <w:rFonts w:ascii="Times New Roman" w:hAnsi="Times New Roman" w:cs="Times New Roman"/>
@@ -575,7 +607,7 @@
     <w:p>
       <w:pPr>
         <w:spacing w:after="0" w:line="240" w:lineRule="auto"/>
-        <w:ind w:firstLine="5670"/>
+        <w:ind w:left="-426" w:firstLine="426"/>
         <w:jc w:val="both"/>
         <w:rPr>
           <w:rFonts w:ascii="Times New Roman" w:hAnsi="Times New Roman" w:cs="Times New Roman"/>
@@ -591,7 +623,7 @@
     <w:p>
       <w:pPr>
         <w:spacing w:after="0" w:line="240" w:lineRule="auto"/>
-        <w:ind w:firstLine="5670"/>
+        <w:ind w:left="-426" w:firstLine="426"/>
         <w:jc w:val="both"/>
         <w:rPr>
           <w:rFonts w:ascii="Times New Roman" w:hAnsi="Times New Roman" w:cs="Times New Roman"/>
@@ -607,6 +639,7 @@
     <w:p>
       <w:pPr>
         <w:spacing w:after="0" w:line="240" w:lineRule="auto"/>
+        <w:ind w:left="-426" w:firstLine="426"/>
         <w:jc w:val="center"/>
         <w:rPr>
           <w:rFonts w:ascii="Times New Roman" w:hAnsi="Times New Roman" w:cs="Times New Roman"/>
@@ -618,6 +651,7 @@
     <w:p>
       <w:pPr>
         <w:spacing w:after="0" w:line="240" w:lineRule="auto"/>
+        <w:ind w:left="-426" w:firstLine="426"/>
         <w:jc w:val="center"/>
         <w:rPr>
           <w:rFonts w:ascii="Times New Roman" w:hAnsi="Times New Roman" w:cs="Times New Roman"/>
@@ -629,6 +663,7 @@
     <w:p>
       <w:pPr>
         <w:spacing w:after="0" w:line="240" w:lineRule="auto"/>
+        <w:ind w:left="-426" w:firstLine="426"/>
         <w:jc w:val="center"/>
         <w:rPr>
           <w:rFonts w:ascii="Times New Roman" w:hAnsi="Times New Roman" w:cs="Times New Roman"/>
@@ -638,7 +673,1253 @@
         <w:rPr>
           <w:rFonts w:ascii="Times New Roman" w:hAnsi="Times New Roman" w:cs="Times New Roman"/>
         </w:rPr>
-        <w:t>Київ - 2026</w:t>
+        <w:t xml:space="preserve">Київ </w:t>
+      </w:r>
+      <w:r>
+        <w:rPr>
+          <w:rFonts w:ascii="Times New Roman" w:hAnsi="Times New Roman" w:cs="Times New Roman"/>
+        </w:rPr>
+        <w:t>–</w:t>
+      </w:r>
+      <w:r>
+        <w:rPr>
+          <w:rFonts w:ascii="Times New Roman" w:hAnsi="Times New Roman" w:cs="Times New Roman"/>
+        </w:rPr>
+        <w:t xml:space="preserve"> 2026</w:t>
+      </w:r>
+    </w:p>
+    <w:p>
+      <w:pPr>
+        <w:ind w:left="-426" w:firstLine="426"/>
+        <w:rPr>
+          <w:rFonts w:ascii="Times New Roman" w:hAnsi="Times New Roman" w:cs="Times New Roman"/>
+        </w:rPr>
+      </w:pPr>
+      <w:r>
+        <w:rPr>
+          <w:rFonts w:ascii="Times New Roman" w:hAnsi="Times New Roman" w:cs="Times New Roman"/>
+        </w:rPr>
+        <w:br w:type="page"/>
+      </w:r>
+    </w:p>
+    <w:p>
+      <w:pPr>
+        <w:spacing w:after="0" w:line="240" w:lineRule="auto"/>
+        <w:ind w:left="-426" w:firstLine="426"/>
+        <w:jc w:val="center"/>
+        <w:rPr>
+          <w:rFonts w:ascii="Times New Roman" w:hAnsi="Times New Roman" w:cs="Times New Roman"/>
+          <w:b/>
+          <w:bCs/>
+          <w:i/>
+          <w:iCs/>
+          <w:sz w:val="28"/>
+          <w:szCs w:val="28"/>
+        </w:rPr>
+      </w:pPr>
+      <w:r>
+        <w:rPr>
+          <w:rFonts w:ascii="Times New Roman" w:hAnsi="Times New Roman" w:cs="Times New Roman"/>
+          <w:b/>
+          <w:bCs/>
+          <w:i/>
+          <w:iCs/>
+          <w:sz w:val="28"/>
+          <w:szCs w:val="28"/>
+        </w:rPr>
+        <w:lastRenderedPageBreak/>
+        <w:t>Постановка задачі</w:t>
+      </w:r>
+    </w:p>
+    <w:p>
+      <w:pPr>
+        <w:spacing w:after="0" w:line="240" w:lineRule="auto"/>
+        <w:ind w:left="-426" w:firstLine="426"/>
+        <w:jc w:val="both"/>
+        <w:rPr>
+          <w:rFonts w:ascii="Times New Roman" w:hAnsi="Times New Roman" w:cs="Times New Roman"/>
+          <w:sz w:val="28"/>
+          <w:szCs w:val="28"/>
+        </w:rPr>
+      </w:pPr>
+    </w:p>
+    <w:p>
+      <w:pPr>
+        <w:spacing w:after="0" w:line="240" w:lineRule="auto"/>
+        <w:ind w:left="-426" w:firstLine="426"/>
+        <w:jc w:val="both"/>
+        <w:rPr>
+          <w:rFonts w:ascii="Times New Roman" w:hAnsi="Times New Roman" w:cs="Times New Roman"/>
+          <w:sz w:val="28"/>
+          <w:szCs w:val="28"/>
+        </w:rPr>
+      </w:pPr>
+      <w:r>
+        <w:rPr>
+          <w:rFonts w:ascii="Times New Roman" w:hAnsi="Times New Roman" w:cs="Times New Roman"/>
+          <w:b/>
+          <w:bCs/>
+          <w:sz w:val="28"/>
+          <w:szCs w:val="28"/>
+        </w:rPr>
+        <w:t>Головна мета:</w:t>
+      </w:r>
+      <w:r>
+        <w:rPr>
+          <w:rFonts w:ascii="Times New Roman" w:hAnsi="Times New Roman" w:cs="Times New Roman"/>
+          <w:sz w:val="28"/>
+          <w:szCs w:val="28"/>
+        </w:rPr>
+        <w:t xml:space="preserve"> Розробити консольну інформаційну систему обліку студентів та викладачів НаУКМА, яка демонструє комплексне використання технологій курсу Advanced Java.</w:t>
+      </w:r>
+    </w:p>
+    <w:p>
+      <w:pPr>
+        <w:spacing w:after="0" w:line="240" w:lineRule="auto"/>
+        <w:ind w:left="-426" w:firstLine="426"/>
+        <w:jc w:val="both"/>
+        <w:rPr>
+          <w:rFonts w:ascii="Times New Roman" w:hAnsi="Times New Roman" w:cs="Times New Roman"/>
+          <w:sz w:val="28"/>
+          <w:szCs w:val="28"/>
+        </w:rPr>
+      </w:pPr>
+      <w:r>
+        <w:rPr>
+          <w:rFonts w:ascii="Times New Roman" w:hAnsi="Times New Roman" w:cs="Times New Roman"/>
+          <w:b/>
+          <w:bCs/>
+          <w:sz w:val="28"/>
+          <w:szCs w:val="28"/>
+        </w:rPr>
+        <w:t>Основні завдання для реалізації:</w:t>
+      </w:r>
+    </w:p>
+    <w:p>
+      <w:pPr>
+        <w:numPr>
+          <w:ilvl w:val="0"/>
+          <w:numId w:val="1"/>
+        </w:numPr>
+        <w:spacing w:after="0" w:line="240" w:lineRule="auto"/>
+        <w:ind w:left="-426" w:firstLine="426"/>
+        <w:jc w:val="both"/>
+        <w:rPr>
+          <w:rFonts w:ascii="Times New Roman" w:hAnsi="Times New Roman" w:cs="Times New Roman"/>
+          <w:sz w:val="28"/>
+          <w:szCs w:val="28"/>
+        </w:rPr>
+      </w:pPr>
+      <w:r>
+        <w:rPr>
+          <w:rFonts w:ascii="Times New Roman" w:hAnsi="Times New Roman" w:cs="Times New Roman"/>
+          <w:b/>
+          <w:bCs/>
+          <w:sz w:val="28"/>
+          <w:szCs w:val="28"/>
+        </w:rPr>
+        <w:t>Моделювання предметної області:</w:t>
+      </w:r>
+    </w:p>
+    <w:p>
+      <w:pPr>
+        <w:numPr>
+          <w:ilvl w:val="1"/>
+          <w:numId w:val="1"/>
+        </w:numPr>
+        <w:tabs>
+          <w:tab w:val="num" w:pos="1440"/>
+        </w:tabs>
+        <w:spacing w:after="0" w:line="240" w:lineRule="auto"/>
+        <w:ind w:left="-426" w:firstLine="426"/>
+        <w:jc w:val="both"/>
+        <w:rPr>
+          <w:rFonts w:ascii="Times New Roman" w:hAnsi="Times New Roman" w:cs="Times New Roman"/>
+          <w:sz w:val="28"/>
+          <w:szCs w:val="28"/>
+        </w:rPr>
+      </w:pPr>
+      <w:r>
+        <w:rPr>
+          <w:rFonts w:ascii="Times New Roman" w:hAnsi="Times New Roman" w:cs="Times New Roman"/>
+          <w:sz w:val="28"/>
+          <w:szCs w:val="28"/>
+        </w:rPr>
+        <w:t>Створити ієрархічну структуру класів для опису сутностей: «Університет», «Факультет», «Кафедра», а також базового типу «Персона» з похідними класами «Студент» та «Викладач».</w:t>
+      </w:r>
+    </w:p>
+    <w:p>
+      <w:pPr>
+        <w:numPr>
+          <w:ilvl w:val="1"/>
+          <w:numId w:val="1"/>
+        </w:numPr>
+        <w:tabs>
+          <w:tab w:val="num" w:pos="1440"/>
+        </w:tabs>
+        <w:spacing w:after="0" w:line="240" w:lineRule="auto"/>
+        <w:ind w:left="-426" w:firstLine="426"/>
+        <w:jc w:val="both"/>
+        <w:rPr>
+          <w:rFonts w:ascii="Times New Roman" w:hAnsi="Times New Roman" w:cs="Times New Roman"/>
+          <w:sz w:val="28"/>
+          <w:szCs w:val="28"/>
+        </w:rPr>
+      </w:pPr>
+      <w:r>
+        <w:rPr>
+          <w:rFonts w:ascii="Times New Roman" w:hAnsi="Times New Roman" w:cs="Times New Roman"/>
+          <w:sz w:val="28"/>
+          <w:szCs w:val="28"/>
+        </w:rPr>
+        <w:t xml:space="preserve">Забезпечити наявність усіх необхідних </w:t>
+      </w:r>
+      <w:r>
+        <w:rPr>
+          <w:rFonts w:ascii="Times New Roman" w:hAnsi="Times New Roman" w:cs="Times New Roman"/>
+          <w:sz w:val="28"/>
+          <w:szCs w:val="28"/>
+        </w:rPr>
+        <w:t>полей</w:t>
+      </w:r>
+      <w:r>
+        <w:rPr>
+          <w:rFonts w:ascii="Times New Roman" w:hAnsi="Times New Roman" w:cs="Times New Roman"/>
+          <w:sz w:val="28"/>
+          <w:szCs w:val="28"/>
+        </w:rPr>
+        <w:t xml:space="preserve"> для кожної сутності (ідентифікатори, ПІБ, контакти, посилання на завідувачів та деканів, форма навчання тощо).</w:t>
+      </w:r>
+    </w:p>
+    <w:p>
+      <w:pPr>
+        <w:numPr>
+          <w:ilvl w:val="0"/>
+          <w:numId w:val="1"/>
+        </w:numPr>
+        <w:spacing w:after="0" w:line="240" w:lineRule="auto"/>
+        <w:ind w:left="-426" w:firstLine="426"/>
+        <w:jc w:val="both"/>
+        <w:rPr>
+          <w:rFonts w:ascii="Times New Roman" w:hAnsi="Times New Roman" w:cs="Times New Roman"/>
+          <w:sz w:val="28"/>
+          <w:szCs w:val="28"/>
+        </w:rPr>
+      </w:pPr>
+      <w:r>
+        <w:rPr>
+          <w:rFonts w:ascii="Times New Roman" w:hAnsi="Times New Roman" w:cs="Times New Roman"/>
+          <w:b/>
+          <w:bCs/>
+          <w:sz w:val="28"/>
+          <w:szCs w:val="28"/>
+        </w:rPr>
+        <w:t>Керування даними (CRUD-операції):</w:t>
+      </w:r>
+    </w:p>
+    <w:p>
+      <w:pPr>
+        <w:numPr>
+          <w:ilvl w:val="1"/>
+          <w:numId w:val="1"/>
+        </w:numPr>
+        <w:tabs>
+          <w:tab w:val="num" w:pos="1440"/>
+        </w:tabs>
+        <w:spacing w:after="0" w:line="240" w:lineRule="auto"/>
+        <w:ind w:left="-426" w:firstLine="426"/>
+        <w:jc w:val="both"/>
+        <w:rPr>
+          <w:rFonts w:ascii="Times New Roman" w:hAnsi="Times New Roman" w:cs="Times New Roman"/>
+          <w:sz w:val="28"/>
+          <w:szCs w:val="28"/>
+        </w:rPr>
+      </w:pPr>
+      <w:r>
+        <w:rPr>
+          <w:rFonts w:ascii="Times New Roman" w:hAnsi="Times New Roman" w:cs="Times New Roman"/>
+          <w:sz w:val="28"/>
+          <w:szCs w:val="28"/>
+        </w:rPr>
+        <w:t>Реалізувати консольне меню для взаємодії з користувачем.</w:t>
+      </w:r>
+    </w:p>
+    <w:p>
+      <w:pPr>
+        <w:numPr>
+          <w:ilvl w:val="1"/>
+          <w:numId w:val="1"/>
+        </w:numPr>
+        <w:tabs>
+          <w:tab w:val="num" w:pos="1440"/>
+        </w:tabs>
+        <w:spacing w:after="0" w:line="240" w:lineRule="auto"/>
+        <w:ind w:left="-426" w:firstLine="426"/>
+        <w:jc w:val="both"/>
+        <w:rPr>
+          <w:rFonts w:ascii="Times New Roman" w:hAnsi="Times New Roman" w:cs="Times New Roman"/>
+          <w:sz w:val="28"/>
+          <w:szCs w:val="28"/>
+        </w:rPr>
+      </w:pPr>
+      <w:r>
+        <w:rPr>
+          <w:rFonts w:ascii="Times New Roman" w:hAnsi="Times New Roman" w:cs="Times New Roman"/>
+          <w:sz w:val="28"/>
+          <w:szCs w:val="28"/>
+        </w:rPr>
+        <w:t>Забезпечити можливості створення, редагування та видалення факультетів і кафедр.</w:t>
+      </w:r>
+    </w:p>
+    <w:p>
+      <w:pPr>
+        <w:numPr>
+          <w:ilvl w:val="1"/>
+          <w:numId w:val="1"/>
+        </w:numPr>
+        <w:tabs>
+          <w:tab w:val="num" w:pos="1440"/>
+        </w:tabs>
+        <w:spacing w:after="0" w:line="240" w:lineRule="auto"/>
+        <w:ind w:left="-426" w:firstLine="426"/>
+        <w:jc w:val="both"/>
+        <w:rPr>
+          <w:rFonts w:ascii="Times New Roman" w:hAnsi="Times New Roman" w:cs="Times New Roman"/>
+          <w:sz w:val="28"/>
+          <w:szCs w:val="28"/>
+        </w:rPr>
+      </w:pPr>
+      <w:r>
+        <w:rPr>
+          <w:rFonts w:ascii="Times New Roman" w:hAnsi="Times New Roman" w:cs="Times New Roman"/>
+          <w:sz w:val="28"/>
+          <w:szCs w:val="28"/>
+        </w:rPr>
+        <w:t>Реалізувати функціонал додавання, редагування та видалення студентів і викладачів</w:t>
+      </w:r>
+      <w:r>
+        <w:rPr>
+          <w:rFonts w:ascii="Times New Roman" w:hAnsi="Times New Roman" w:cs="Times New Roman"/>
+          <w:sz w:val="28"/>
+          <w:szCs w:val="28"/>
+        </w:rPr>
+        <w:t>.</w:t>
+      </w:r>
+    </w:p>
+    <w:p>
+      <w:pPr>
+        <w:numPr>
+          <w:ilvl w:val="0"/>
+          <w:numId w:val="1"/>
+        </w:numPr>
+        <w:spacing w:after="0" w:line="240" w:lineRule="auto"/>
+        <w:ind w:left="-426" w:firstLine="426"/>
+        <w:jc w:val="both"/>
+        <w:rPr>
+          <w:rFonts w:ascii="Times New Roman" w:hAnsi="Times New Roman" w:cs="Times New Roman"/>
+          <w:sz w:val="28"/>
+          <w:szCs w:val="28"/>
+        </w:rPr>
+      </w:pPr>
+      <w:r>
+        <w:rPr>
+          <w:rFonts w:ascii="Times New Roman" w:hAnsi="Times New Roman" w:cs="Times New Roman"/>
+          <w:b/>
+          <w:bCs/>
+          <w:sz w:val="28"/>
+          <w:szCs w:val="28"/>
+        </w:rPr>
+        <w:t>Збереження та обробка даних:</w:t>
+      </w:r>
+    </w:p>
+    <w:p>
+      <w:pPr>
+        <w:numPr>
+          <w:ilvl w:val="1"/>
+          <w:numId w:val="1"/>
+        </w:numPr>
+        <w:tabs>
+          <w:tab w:val="num" w:pos="1440"/>
+        </w:tabs>
+        <w:spacing w:after="0" w:line="240" w:lineRule="auto"/>
+        <w:ind w:left="-426" w:firstLine="426"/>
+        <w:jc w:val="both"/>
+        <w:rPr>
+          <w:rFonts w:ascii="Times New Roman" w:hAnsi="Times New Roman" w:cs="Times New Roman"/>
+          <w:sz w:val="28"/>
+          <w:szCs w:val="28"/>
+        </w:rPr>
+      </w:pPr>
+      <w:r>
+        <w:rPr>
+          <w:rFonts w:ascii="Times New Roman" w:hAnsi="Times New Roman" w:cs="Times New Roman"/>
+          <w:sz w:val="28"/>
+          <w:szCs w:val="28"/>
+        </w:rPr>
+        <w:t>Організувати збереження даних системи у структурованому вигляді.</w:t>
+      </w:r>
+    </w:p>
+    <w:p>
+      <w:pPr>
+        <w:numPr>
+          <w:ilvl w:val="1"/>
+          <w:numId w:val="1"/>
+        </w:numPr>
+        <w:tabs>
+          <w:tab w:val="num" w:pos="1440"/>
+        </w:tabs>
+        <w:spacing w:after="0" w:line="240" w:lineRule="auto"/>
+        <w:ind w:left="-426" w:firstLine="426"/>
+        <w:jc w:val="both"/>
+        <w:rPr>
+          <w:rFonts w:ascii="Times New Roman" w:hAnsi="Times New Roman" w:cs="Times New Roman"/>
+          <w:sz w:val="28"/>
+          <w:szCs w:val="28"/>
+        </w:rPr>
+      </w:pPr>
+      <w:r>
+        <w:rPr>
+          <w:rFonts w:ascii="Times New Roman" w:hAnsi="Times New Roman" w:cs="Times New Roman"/>
+          <w:sz w:val="28"/>
+          <w:szCs w:val="28"/>
+        </w:rPr>
+        <w:t>Використати сучасні інструменти Java для роботи з даними (Stream API, колекції, I/O).</w:t>
+      </w:r>
+    </w:p>
+    <w:p>
+      <w:pPr>
+        <w:numPr>
+          <w:ilvl w:val="0"/>
+          <w:numId w:val="1"/>
+        </w:numPr>
+        <w:spacing w:after="0" w:line="240" w:lineRule="auto"/>
+        <w:ind w:left="-426" w:firstLine="426"/>
+        <w:jc w:val="both"/>
+        <w:rPr>
+          <w:rFonts w:ascii="Times New Roman" w:hAnsi="Times New Roman" w:cs="Times New Roman"/>
+          <w:sz w:val="28"/>
+          <w:szCs w:val="28"/>
+        </w:rPr>
+      </w:pPr>
+      <w:r>
+        <w:rPr>
+          <w:rFonts w:ascii="Times New Roman" w:hAnsi="Times New Roman" w:cs="Times New Roman"/>
+          <w:b/>
+          <w:bCs/>
+          <w:sz w:val="28"/>
+          <w:szCs w:val="28"/>
+        </w:rPr>
+        <w:t>Технічні та організаційні вимоги:</w:t>
+      </w:r>
+    </w:p>
+    <w:p>
+      <w:pPr>
+        <w:numPr>
+          <w:ilvl w:val="1"/>
+          <w:numId w:val="1"/>
+        </w:numPr>
+        <w:tabs>
+          <w:tab w:val="num" w:pos="1440"/>
+        </w:tabs>
+        <w:spacing w:after="0" w:line="240" w:lineRule="auto"/>
+        <w:ind w:left="-426" w:firstLine="426"/>
+        <w:jc w:val="both"/>
+        <w:rPr>
+          <w:rFonts w:ascii="Times New Roman" w:hAnsi="Times New Roman" w:cs="Times New Roman"/>
+          <w:sz w:val="28"/>
+          <w:szCs w:val="28"/>
+        </w:rPr>
+      </w:pPr>
+      <w:r>
+        <w:rPr>
+          <w:rFonts w:ascii="Times New Roman" w:hAnsi="Times New Roman" w:cs="Times New Roman"/>
+          <w:sz w:val="28"/>
+          <w:szCs w:val="28"/>
+        </w:rPr>
+        <w:t>Покрити в проєкті основні теми Advanced Java (ООП, дженер</w:t>
+      </w:r>
+      <w:r>
+        <w:rPr>
+          <w:rFonts w:ascii="Times New Roman" w:hAnsi="Times New Roman" w:cs="Times New Roman"/>
+          <w:sz w:val="28"/>
+          <w:szCs w:val="28"/>
+        </w:rPr>
+        <w:t>і</w:t>
+      </w:r>
+      <w:r>
+        <w:rPr>
+          <w:rFonts w:ascii="Times New Roman" w:hAnsi="Times New Roman" w:cs="Times New Roman"/>
+          <w:sz w:val="28"/>
+          <w:szCs w:val="28"/>
+        </w:rPr>
+        <w:t>ки, винятки, логування</w:t>
+      </w:r>
+      <w:r>
+        <w:rPr>
+          <w:rFonts w:ascii="Times New Roman" w:hAnsi="Times New Roman" w:cs="Times New Roman"/>
+          <w:sz w:val="28"/>
+          <w:szCs w:val="28"/>
+        </w:rPr>
+        <w:t>, лямбди</w:t>
+      </w:r>
+      <w:r>
+        <w:rPr>
+          <w:rFonts w:ascii="Times New Roman" w:hAnsi="Times New Roman" w:cs="Times New Roman"/>
+          <w:sz w:val="28"/>
+          <w:szCs w:val="28"/>
+        </w:rPr>
+        <w:t xml:space="preserve">, багатопоточність, </w:t>
+      </w:r>
+      <w:r>
+        <w:rPr>
+          <w:rFonts w:ascii="Times New Roman" w:hAnsi="Times New Roman" w:cs="Times New Roman"/>
+          <w:sz w:val="28"/>
+          <w:szCs w:val="28"/>
+          <w:lang w:val="en-US"/>
+        </w:rPr>
+        <w:t>Reflections</w:t>
+      </w:r>
+      <w:r>
+        <w:rPr>
+          <w:rFonts w:ascii="Times New Roman" w:hAnsi="Times New Roman" w:cs="Times New Roman"/>
+          <w:sz w:val="28"/>
+          <w:szCs w:val="28"/>
+        </w:rPr>
+        <w:t>, анотації та тестування).</w:t>
+      </w:r>
+    </w:p>
+    <w:p>
+      <w:pPr>
+        <w:numPr>
+          <w:ilvl w:val="1"/>
+          <w:numId w:val="1"/>
+        </w:numPr>
+        <w:spacing w:after="0" w:line="240" w:lineRule="auto"/>
+        <w:ind w:left="-426" w:firstLine="426"/>
+        <w:jc w:val="both"/>
+        <w:rPr>
+          <w:rFonts w:ascii="Times New Roman" w:hAnsi="Times New Roman" w:cs="Times New Roman"/>
+          <w:sz w:val="28"/>
+          <w:szCs w:val="28"/>
+        </w:rPr>
+      </w:pPr>
+      <w:r>
+        <w:rPr>
+          <w:rFonts w:ascii="Times New Roman" w:hAnsi="Times New Roman" w:cs="Times New Roman"/>
+          <w:sz w:val="28"/>
+          <w:szCs w:val="28"/>
+        </w:rPr>
+        <w:t xml:space="preserve">Організувати </w:t>
+      </w:r>
+      <w:r>
+        <w:rPr>
+          <w:rFonts w:ascii="Times New Roman" w:hAnsi="Times New Roman" w:cs="Times New Roman"/>
+          <w:sz w:val="28"/>
+          <w:szCs w:val="28"/>
+        </w:rPr>
+        <w:t>парну</w:t>
+      </w:r>
+      <w:r>
+        <w:rPr>
+          <w:rFonts w:ascii="Times New Roman" w:hAnsi="Times New Roman" w:cs="Times New Roman"/>
+          <w:sz w:val="28"/>
+          <w:szCs w:val="28"/>
+        </w:rPr>
+        <w:t xml:space="preserve"> роботу </w:t>
+      </w:r>
+      <w:r>
+        <w:rPr>
+          <w:rFonts w:ascii="Times New Roman" w:hAnsi="Times New Roman" w:cs="Times New Roman"/>
+          <w:sz w:val="28"/>
+          <w:szCs w:val="28"/>
+        </w:rPr>
+        <w:t xml:space="preserve">з </w:t>
+      </w:r>
+      <w:r>
+        <w:rPr>
+          <w:rFonts w:ascii="Times New Roman" w:hAnsi="Times New Roman" w:cs="Times New Roman"/>
+          <w:sz w:val="28"/>
+          <w:szCs w:val="28"/>
+        </w:rPr>
+        <w:t>використанням системи контролю версій Git (ведення історії комітів та створення pull requests на GitHub).</w:t>
+      </w:r>
+    </w:p>
+    <w:p>
+      <w:pPr>
+        <w:rPr>
+          <w:rFonts w:ascii="Times New Roman" w:hAnsi="Times New Roman" w:cs="Times New Roman"/>
+          <w:sz w:val="28"/>
+          <w:szCs w:val="28"/>
+        </w:rPr>
+      </w:pPr>
+    </w:p>
+    <w:p>
+      <w:pPr>
+        <w:rPr>
+          <w:rFonts w:ascii="Times New Roman" w:hAnsi="Times New Roman" w:cs="Times New Roman"/>
+          <w:b/>
+          <w:bCs/>
+          <w:i/>
+          <w:iCs/>
+          <w:sz w:val="28"/>
+          <w:szCs w:val="28"/>
+        </w:rPr>
+      </w:pPr>
+      <w:r>
+        <w:rPr>
+          <w:rFonts w:ascii="Times New Roman" w:hAnsi="Times New Roman" w:cs="Times New Roman"/>
+          <w:b/>
+          <w:bCs/>
+          <w:i/>
+          <w:iCs/>
+          <w:sz w:val="28"/>
+          <w:szCs w:val="28"/>
+        </w:rPr>
+        <w:br w:type="page"/>
+      </w:r>
+    </w:p>
+    <w:p>
+      <w:pPr>
+        <w:spacing w:after="0" w:line="240" w:lineRule="auto"/>
+        <w:ind w:left="-426" w:firstLine="426"/>
+        <w:jc w:val="center"/>
+        <w:rPr>
+          <w:rFonts w:ascii="Times New Roman" w:hAnsi="Times New Roman" w:cs="Times New Roman"/>
+          <w:b/>
+          <w:bCs/>
+          <w:i/>
+          <w:iCs/>
+          <w:sz w:val="28"/>
+          <w:szCs w:val="28"/>
+        </w:rPr>
+      </w:pPr>
+      <w:r>
+        <w:rPr>
+          <w:rFonts w:ascii="Times New Roman" w:hAnsi="Times New Roman" w:cs="Times New Roman"/>
+          <w:b/>
+          <w:bCs/>
+          <w:i/>
+          <w:iCs/>
+          <w:sz w:val="28"/>
+          <w:szCs w:val="28"/>
+        </w:rPr>
+        <w:lastRenderedPageBreak/>
+        <w:t>Розподіл ролей</w:t>
+      </w:r>
+    </w:p>
+    <w:p>
+      <w:pPr>
+        <w:spacing w:after="0" w:line="240" w:lineRule="auto"/>
+        <w:ind w:left="-426" w:firstLine="426"/>
+        <w:rPr>
+          <w:rFonts w:ascii="Times New Roman" w:hAnsi="Times New Roman" w:cs="Times New Roman"/>
+          <w:i/>
+          <w:iCs/>
+          <w:sz w:val="28"/>
+          <w:szCs w:val="28"/>
+        </w:rPr>
+      </w:pPr>
+      <w:r>
+        <w:rPr>
+          <w:rFonts w:ascii="Times New Roman" w:hAnsi="Times New Roman" w:cs="Times New Roman"/>
+          <w:i/>
+          <w:iCs/>
+          <w:sz w:val="28"/>
+          <w:szCs w:val="28"/>
+        </w:rPr>
+        <w:t xml:space="preserve">Шепетюк Ангеліна: </w:t>
+      </w:r>
+    </w:p>
+    <w:p>
+      <w:pPr>
+        <w:pStyle w:val="a9"/>
+        <w:numPr>
+          <w:ilvl w:val="0"/>
+          <w:numId w:val="3"/>
+        </w:numPr>
+        <w:spacing w:after="0" w:line="240" w:lineRule="auto"/>
+        <w:rPr>
+          <w:rFonts w:ascii="Times New Roman" w:hAnsi="Times New Roman" w:cs="Times New Roman"/>
+          <w:sz w:val="28"/>
+          <w:szCs w:val="28"/>
+        </w:rPr>
+      </w:pPr>
+      <w:r>
+        <w:rPr>
+          <w:rFonts w:ascii="Times New Roman" w:hAnsi="Times New Roman" w:cs="Times New Roman"/>
+          <w:sz w:val="28"/>
+          <w:szCs w:val="28"/>
+        </w:rPr>
+        <w:t>Управління об’єктами</w:t>
+      </w:r>
+      <w:r>
+        <w:rPr>
+          <w:rFonts w:ascii="Times New Roman" w:hAnsi="Times New Roman" w:cs="Times New Roman"/>
+          <w:sz w:val="28"/>
+          <w:szCs w:val="28"/>
+        </w:rPr>
+        <w:t xml:space="preserve"> Університету, Кафедри та Факультету</w:t>
+      </w:r>
+    </w:p>
+    <w:p>
+      <w:pPr>
+        <w:pStyle w:val="a9"/>
+        <w:numPr>
+          <w:ilvl w:val="1"/>
+          <w:numId w:val="3"/>
+        </w:numPr>
+        <w:spacing w:after="0" w:line="240" w:lineRule="auto"/>
+        <w:rPr>
+          <w:rFonts w:ascii="Times New Roman" w:hAnsi="Times New Roman" w:cs="Times New Roman"/>
+          <w:sz w:val="28"/>
+          <w:szCs w:val="28"/>
+        </w:rPr>
+      </w:pPr>
+      <w:r>
+        <w:rPr>
+          <w:rFonts w:ascii="Times New Roman" w:hAnsi="Times New Roman" w:cs="Times New Roman"/>
+          <w:sz w:val="28"/>
+          <w:szCs w:val="28"/>
+        </w:rPr>
+        <w:t>Створення</w:t>
+      </w:r>
+      <w:r>
+        <w:rPr>
+          <w:rFonts w:ascii="Times New Roman" w:hAnsi="Times New Roman" w:cs="Times New Roman"/>
+          <w:sz w:val="28"/>
+          <w:szCs w:val="28"/>
+        </w:rPr>
+        <w:t xml:space="preserve"> класів з</w:t>
+      </w:r>
+      <w:r>
+        <w:rPr>
+          <w:rFonts w:ascii="Times New Roman" w:hAnsi="Times New Roman" w:cs="Times New Roman"/>
+          <w:sz w:val="28"/>
+          <w:szCs w:val="28"/>
+        </w:rPr>
+        <w:t xml:space="preserve"> базови</w:t>
+      </w:r>
+      <w:r>
+        <w:rPr>
+          <w:rFonts w:ascii="Times New Roman" w:hAnsi="Times New Roman" w:cs="Times New Roman"/>
+          <w:sz w:val="28"/>
+          <w:szCs w:val="28"/>
+        </w:rPr>
+        <w:t>ми</w:t>
+      </w:r>
+      <w:r>
+        <w:rPr>
+          <w:rFonts w:ascii="Times New Roman" w:hAnsi="Times New Roman" w:cs="Times New Roman"/>
+          <w:sz w:val="28"/>
+          <w:szCs w:val="28"/>
+        </w:rPr>
+        <w:t xml:space="preserve"> пол</w:t>
+      </w:r>
+      <w:r>
+        <w:rPr>
+          <w:rFonts w:ascii="Times New Roman" w:hAnsi="Times New Roman" w:cs="Times New Roman"/>
+          <w:sz w:val="28"/>
+          <w:szCs w:val="28"/>
+        </w:rPr>
+        <w:t>ями</w:t>
+      </w:r>
+      <w:r>
+        <w:rPr>
+          <w:rFonts w:ascii="Times New Roman" w:hAnsi="Times New Roman" w:cs="Times New Roman"/>
+          <w:sz w:val="28"/>
+          <w:szCs w:val="28"/>
+        </w:rPr>
+        <w:t>, конструктор</w:t>
+      </w:r>
+      <w:r>
+        <w:rPr>
+          <w:rFonts w:ascii="Times New Roman" w:hAnsi="Times New Roman" w:cs="Times New Roman"/>
+          <w:sz w:val="28"/>
+          <w:szCs w:val="28"/>
+        </w:rPr>
+        <w:t>ами</w:t>
+      </w:r>
+      <w:r>
+        <w:rPr>
+          <w:rFonts w:ascii="Times New Roman" w:hAnsi="Times New Roman" w:cs="Times New Roman"/>
+          <w:sz w:val="28"/>
+          <w:szCs w:val="28"/>
+        </w:rPr>
+        <w:t xml:space="preserve">, </w:t>
+      </w:r>
+      <w:r>
+        <w:rPr>
+          <w:rFonts w:ascii="Times New Roman" w:hAnsi="Times New Roman" w:cs="Times New Roman"/>
+          <w:sz w:val="28"/>
+          <w:szCs w:val="28"/>
+          <w:lang w:val="en-US"/>
+        </w:rPr>
+        <w:t>toString</w:t>
+      </w:r>
+      <w:r>
+        <w:rPr>
+          <w:rFonts w:ascii="Times New Roman" w:hAnsi="Times New Roman" w:cs="Times New Roman"/>
+          <w:sz w:val="28"/>
+          <w:szCs w:val="28"/>
+          <w:lang w:val="ru-RU"/>
+        </w:rPr>
+        <w:t xml:space="preserve">(), </w:t>
+      </w:r>
+      <w:r>
+        <w:rPr>
+          <w:rFonts w:ascii="Times New Roman" w:hAnsi="Times New Roman" w:cs="Times New Roman"/>
+          <w:sz w:val="28"/>
+          <w:szCs w:val="28"/>
+          <w:lang w:val="en-US"/>
+        </w:rPr>
+        <w:t>hashCode</w:t>
+      </w:r>
+      <w:r>
+        <w:rPr>
+          <w:rFonts w:ascii="Times New Roman" w:hAnsi="Times New Roman" w:cs="Times New Roman"/>
+          <w:sz w:val="28"/>
+          <w:szCs w:val="28"/>
+          <w:lang w:val="ru-RU"/>
+        </w:rPr>
+        <w:t xml:space="preserve">() </w:t>
+      </w:r>
+      <w:r>
+        <w:rPr>
+          <w:rFonts w:ascii="Times New Roman" w:hAnsi="Times New Roman" w:cs="Times New Roman"/>
+          <w:sz w:val="28"/>
+          <w:szCs w:val="28"/>
+        </w:rPr>
+        <w:t xml:space="preserve">та </w:t>
+      </w:r>
+      <w:r>
+        <w:rPr>
+          <w:rFonts w:ascii="Times New Roman" w:hAnsi="Times New Roman" w:cs="Times New Roman"/>
+          <w:sz w:val="28"/>
+          <w:szCs w:val="28"/>
+          <w:lang w:val="en-US"/>
+        </w:rPr>
+        <w:t>equals</w:t>
+      </w:r>
+      <w:r>
+        <w:rPr>
+          <w:rFonts w:ascii="Times New Roman" w:hAnsi="Times New Roman" w:cs="Times New Roman"/>
+          <w:sz w:val="28"/>
+          <w:szCs w:val="28"/>
+          <w:lang w:val="ru-RU"/>
+        </w:rPr>
+        <w:t>()</w:t>
+      </w:r>
+    </w:p>
+    <w:p>
+      <w:pPr>
+        <w:pStyle w:val="a9"/>
+        <w:numPr>
+          <w:ilvl w:val="1"/>
+          <w:numId w:val="3"/>
+        </w:numPr>
+        <w:spacing w:after="0" w:line="240" w:lineRule="auto"/>
+        <w:rPr>
+          <w:rFonts w:ascii="Times New Roman" w:hAnsi="Times New Roman" w:cs="Times New Roman"/>
+          <w:sz w:val="28"/>
+          <w:szCs w:val="28"/>
+        </w:rPr>
+      </w:pPr>
+      <w:r>
+        <w:rPr>
+          <w:rFonts w:ascii="Times New Roman" w:hAnsi="Times New Roman" w:cs="Times New Roman"/>
+          <w:sz w:val="28"/>
+          <w:szCs w:val="28"/>
+        </w:rPr>
+        <w:t>Розробка консольних сервісів, що дають опції для видалення/створення/редагування Кафедр та Факультетів</w:t>
+      </w:r>
+    </w:p>
+    <w:p>
+      <w:pPr>
+        <w:pStyle w:val="a9"/>
+        <w:numPr>
+          <w:ilvl w:val="1"/>
+          <w:numId w:val="3"/>
+        </w:numPr>
+        <w:spacing w:after="0" w:line="240" w:lineRule="auto"/>
+        <w:rPr>
+          <w:rFonts w:ascii="Times New Roman" w:hAnsi="Times New Roman" w:cs="Times New Roman"/>
+          <w:sz w:val="28"/>
+          <w:szCs w:val="28"/>
+        </w:rPr>
+      </w:pPr>
+      <w:r>
+        <w:rPr>
+          <w:rFonts w:ascii="Times New Roman" w:hAnsi="Times New Roman" w:cs="Times New Roman"/>
+          <w:sz w:val="28"/>
+          <w:szCs w:val="28"/>
+        </w:rPr>
+        <w:t>Створення методів для пошуку та зберігання Кафедр та Факультетів</w:t>
+      </w:r>
+    </w:p>
+    <w:p>
+      <w:pPr>
+        <w:pStyle w:val="a9"/>
+        <w:numPr>
+          <w:ilvl w:val="0"/>
+          <w:numId w:val="3"/>
+        </w:numPr>
+        <w:spacing w:after="0" w:line="240" w:lineRule="auto"/>
+        <w:rPr>
+          <w:rFonts w:ascii="Times New Roman" w:hAnsi="Times New Roman" w:cs="Times New Roman"/>
+          <w:sz w:val="28"/>
+          <w:szCs w:val="28"/>
+        </w:rPr>
+      </w:pPr>
+      <w:r>
+        <w:rPr>
+          <w:rFonts w:ascii="Times New Roman" w:hAnsi="Times New Roman" w:cs="Times New Roman"/>
+          <w:sz w:val="28"/>
+          <w:szCs w:val="28"/>
+        </w:rPr>
+        <w:t>Авторизація та керування користувачами</w:t>
+      </w:r>
+    </w:p>
+    <w:p>
+      <w:pPr>
+        <w:pStyle w:val="a9"/>
+        <w:numPr>
+          <w:ilvl w:val="1"/>
+          <w:numId w:val="3"/>
+        </w:numPr>
+        <w:spacing w:after="0" w:line="240" w:lineRule="auto"/>
+        <w:rPr>
+          <w:rFonts w:ascii="Times New Roman" w:hAnsi="Times New Roman" w:cs="Times New Roman"/>
+          <w:sz w:val="28"/>
+          <w:szCs w:val="28"/>
+        </w:rPr>
+      </w:pPr>
+      <w:r>
+        <w:rPr>
+          <w:rFonts w:ascii="Times New Roman" w:hAnsi="Times New Roman" w:cs="Times New Roman"/>
+          <w:sz w:val="28"/>
+          <w:szCs w:val="28"/>
+        </w:rPr>
+        <w:t xml:space="preserve">Створення класу </w:t>
+      </w:r>
+      <w:r>
+        <w:rPr>
+          <w:rFonts w:ascii="Times New Roman" w:hAnsi="Times New Roman" w:cs="Times New Roman"/>
+          <w:sz w:val="28"/>
+          <w:szCs w:val="28"/>
+          <w:lang w:val="en-US"/>
+        </w:rPr>
+        <w:t>User</w:t>
+      </w:r>
+    </w:p>
+    <w:p>
+      <w:pPr>
+        <w:pStyle w:val="a9"/>
+        <w:numPr>
+          <w:ilvl w:val="1"/>
+          <w:numId w:val="3"/>
+        </w:numPr>
+        <w:spacing w:after="0" w:line="240" w:lineRule="auto"/>
+        <w:rPr>
+          <w:rFonts w:ascii="Times New Roman" w:hAnsi="Times New Roman" w:cs="Times New Roman"/>
+          <w:sz w:val="28"/>
+          <w:szCs w:val="28"/>
+        </w:rPr>
+      </w:pPr>
+      <w:r>
+        <w:rPr>
+          <w:rFonts w:ascii="Times New Roman" w:hAnsi="Times New Roman" w:cs="Times New Roman"/>
+          <w:sz w:val="28"/>
+          <w:szCs w:val="28"/>
+        </w:rPr>
+        <w:t>Додання можливості входу в акаунт за логіном та паролем</w:t>
+      </w:r>
+    </w:p>
+    <w:p>
+      <w:pPr>
+        <w:pStyle w:val="a9"/>
+        <w:numPr>
+          <w:ilvl w:val="1"/>
+          <w:numId w:val="3"/>
+        </w:numPr>
+        <w:spacing w:after="0" w:line="240" w:lineRule="auto"/>
+        <w:rPr>
+          <w:rFonts w:ascii="Times New Roman" w:hAnsi="Times New Roman" w:cs="Times New Roman"/>
+          <w:sz w:val="28"/>
+          <w:szCs w:val="28"/>
+        </w:rPr>
+      </w:pPr>
+      <w:r>
+        <w:rPr>
+          <w:rFonts w:ascii="Times New Roman" w:hAnsi="Times New Roman" w:cs="Times New Roman"/>
+          <w:sz w:val="28"/>
+          <w:szCs w:val="28"/>
+        </w:rPr>
+        <w:t>Перевірка прав доступу для ролей (Користувач, Адмін, Менеджер) з використанням побітових масок</w:t>
+      </w:r>
+    </w:p>
+    <w:p>
+      <w:pPr>
+        <w:pStyle w:val="a9"/>
+        <w:numPr>
+          <w:ilvl w:val="1"/>
+          <w:numId w:val="3"/>
+        </w:numPr>
+        <w:spacing w:after="0" w:line="240" w:lineRule="auto"/>
+        <w:rPr>
+          <w:rFonts w:ascii="Times New Roman" w:hAnsi="Times New Roman" w:cs="Times New Roman"/>
+          <w:sz w:val="28"/>
+          <w:szCs w:val="28"/>
+        </w:rPr>
+      </w:pPr>
+      <w:r>
+        <w:rPr>
+          <w:rFonts w:ascii="Times New Roman" w:hAnsi="Times New Roman" w:cs="Times New Roman"/>
+          <w:sz w:val="28"/>
+          <w:szCs w:val="28"/>
+        </w:rPr>
+        <w:t>Створення сервісу та меню для керування акаунтами</w:t>
+      </w:r>
+    </w:p>
+    <w:p>
+      <w:pPr>
+        <w:pStyle w:val="a9"/>
+        <w:numPr>
+          <w:ilvl w:val="1"/>
+          <w:numId w:val="3"/>
+        </w:numPr>
+        <w:spacing w:after="0" w:line="240" w:lineRule="auto"/>
+        <w:rPr>
+          <w:rFonts w:ascii="Times New Roman" w:hAnsi="Times New Roman" w:cs="Times New Roman"/>
+          <w:sz w:val="28"/>
+          <w:szCs w:val="28"/>
+        </w:rPr>
+      </w:pPr>
+      <w:r>
+        <w:rPr>
+          <w:rFonts w:ascii="Times New Roman" w:hAnsi="Times New Roman" w:cs="Times New Roman"/>
+          <w:sz w:val="28"/>
+          <w:szCs w:val="28"/>
+        </w:rPr>
+        <w:t xml:space="preserve">Побітове </w:t>
+      </w:r>
+      <w:r>
+        <w:rPr>
+          <w:rFonts w:ascii="Times New Roman" w:hAnsi="Times New Roman" w:cs="Times New Roman"/>
+          <w:sz w:val="28"/>
+          <w:szCs w:val="28"/>
+          <w:lang w:val="en-US"/>
+        </w:rPr>
+        <w:t>XOR-</w:t>
+      </w:r>
+      <w:r>
+        <w:rPr>
+          <w:rFonts w:ascii="Times New Roman" w:hAnsi="Times New Roman" w:cs="Times New Roman"/>
+          <w:sz w:val="28"/>
+          <w:szCs w:val="28"/>
+        </w:rPr>
+        <w:t>шифрування паролю</w:t>
+      </w:r>
+    </w:p>
+    <w:p>
+      <w:pPr>
+        <w:pStyle w:val="a9"/>
+        <w:numPr>
+          <w:ilvl w:val="1"/>
+          <w:numId w:val="3"/>
+        </w:numPr>
+        <w:spacing w:after="0" w:line="240" w:lineRule="auto"/>
+        <w:rPr>
+          <w:rFonts w:ascii="Times New Roman" w:hAnsi="Times New Roman" w:cs="Times New Roman"/>
+          <w:sz w:val="28"/>
+          <w:szCs w:val="28"/>
+        </w:rPr>
+      </w:pPr>
+      <w:r>
+        <w:rPr>
+          <w:rFonts w:ascii="Times New Roman" w:hAnsi="Times New Roman" w:cs="Times New Roman"/>
+          <w:sz w:val="28"/>
+          <w:szCs w:val="28"/>
+        </w:rPr>
+        <w:t xml:space="preserve">Серіалізація користувачів до </w:t>
+      </w:r>
+      <w:r>
+        <w:rPr>
+          <w:rFonts w:ascii="Times New Roman" w:hAnsi="Times New Roman" w:cs="Times New Roman"/>
+          <w:sz w:val="28"/>
+          <w:szCs w:val="28"/>
+          <w:lang w:val="ru-RU"/>
+        </w:rPr>
+        <w:t>.</w:t>
+      </w:r>
+      <w:r>
+        <w:rPr>
+          <w:rFonts w:ascii="Times New Roman" w:hAnsi="Times New Roman" w:cs="Times New Roman"/>
+          <w:sz w:val="28"/>
+          <w:szCs w:val="28"/>
+          <w:lang w:val="en-US"/>
+        </w:rPr>
+        <w:t>json</w:t>
+      </w:r>
+      <w:r>
+        <w:rPr>
+          <w:rFonts w:ascii="Times New Roman" w:hAnsi="Times New Roman" w:cs="Times New Roman"/>
+          <w:sz w:val="28"/>
+          <w:szCs w:val="28"/>
+          <w:lang w:val="ru-RU"/>
+        </w:rPr>
+        <w:t xml:space="preserve"> </w:t>
+      </w:r>
+      <w:r>
+        <w:rPr>
+          <w:rFonts w:ascii="Times New Roman" w:hAnsi="Times New Roman" w:cs="Times New Roman"/>
+          <w:sz w:val="28"/>
+          <w:szCs w:val="28"/>
+        </w:rPr>
+        <w:t xml:space="preserve">файлу </w:t>
+      </w:r>
+    </w:p>
+    <w:p>
+      <w:pPr>
+        <w:pStyle w:val="a9"/>
+        <w:numPr>
+          <w:ilvl w:val="0"/>
+          <w:numId w:val="3"/>
+        </w:numPr>
+        <w:spacing w:after="0" w:line="240" w:lineRule="auto"/>
+        <w:rPr>
+          <w:rFonts w:ascii="Times New Roman" w:hAnsi="Times New Roman" w:cs="Times New Roman"/>
+          <w:sz w:val="28"/>
+          <w:szCs w:val="28"/>
+        </w:rPr>
+      </w:pPr>
+      <w:r>
+        <w:rPr>
+          <w:rFonts w:ascii="Times New Roman" w:hAnsi="Times New Roman" w:cs="Times New Roman"/>
+          <w:sz w:val="28"/>
+          <w:szCs w:val="28"/>
+        </w:rPr>
+        <w:t>Валідація та логування</w:t>
+      </w:r>
+    </w:p>
+    <w:p>
+      <w:pPr>
+        <w:pStyle w:val="a9"/>
+        <w:numPr>
+          <w:ilvl w:val="1"/>
+          <w:numId w:val="3"/>
+        </w:numPr>
+        <w:spacing w:after="0" w:line="240" w:lineRule="auto"/>
+        <w:rPr>
+          <w:rFonts w:ascii="Times New Roman" w:hAnsi="Times New Roman" w:cs="Times New Roman"/>
+          <w:sz w:val="28"/>
+          <w:szCs w:val="28"/>
+        </w:rPr>
+      </w:pPr>
+      <w:r>
+        <w:rPr>
+          <w:rFonts w:ascii="Times New Roman" w:hAnsi="Times New Roman" w:cs="Times New Roman"/>
+          <w:sz w:val="28"/>
+          <w:szCs w:val="28"/>
+        </w:rPr>
+        <w:t>Перетворення звичайного виводу в консоль у логування в файл+консоль</w:t>
+      </w:r>
+    </w:p>
+    <w:p>
+      <w:pPr>
+        <w:pStyle w:val="a9"/>
+        <w:numPr>
+          <w:ilvl w:val="1"/>
+          <w:numId w:val="3"/>
+        </w:numPr>
+        <w:spacing w:after="0" w:line="240" w:lineRule="auto"/>
+        <w:rPr>
+          <w:rFonts w:ascii="Times New Roman" w:hAnsi="Times New Roman" w:cs="Times New Roman"/>
+          <w:sz w:val="28"/>
+          <w:szCs w:val="28"/>
+        </w:rPr>
+      </w:pPr>
+      <w:r>
+        <w:rPr>
+          <w:rFonts w:ascii="Times New Roman" w:hAnsi="Times New Roman" w:cs="Times New Roman"/>
+          <w:sz w:val="28"/>
+          <w:szCs w:val="28"/>
+        </w:rPr>
+        <w:t xml:space="preserve">Створення методів для коректного отримання </w:t>
+      </w:r>
+      <w:r>
+        <w:rPr>
+          <w:rFonts w:ascii="Times New Roman" w:hAnsi="Times New Roman" w:cs="Times New Roman"/>
+          <w:sz w:val="28"/>
+          <w:szCs w:val="28"/>
+        </w:rPr>
+        <w:t xml:space="preserve">числових </w:t>
+      </w:r>
+      <w:r>
+        <w:rPr>
+          <w:rFonts w:ascii="Times New Roman" w:hAnsi="Times New Roman" w:cs="Times New Roman"/>
+          <w:sz w:val="28"/>
+          <w:szCs w:val="28"/>
+        </w:rPr>
+        <w:t>даних від користувача</w:t>
+      </w:r>
+    </w:p>
+    <w:p>
+      <w:pPr>
+        <w:pStyle w:val="a9"/>
+        <w:numPr>
+          <w:ilvl w:val="1"/>
+          <w:numId w:val="3"/>
+        </w:numPr>
+        <w:spacing w:after="0" w:line="240" w:lineRule="auto"/>
+        <w:rPr>
+          <w:rFonts w:ascii="Times New Roman" w:hAnsi="Times New Roman" w:cs="Times New Roman"/>
+          <w:sz w:val="28"/>
+          <w:szCs w:val="28"/>
+        </w:rPr>
+      </w:pPr>
+      <w:r>
+        <w:rPr>
+          <w:rFonts w:ascii="Times New Roman" w:hAnsi="Times New Roman" w:cs="Times New Roman"/>
+          <w:sz w:val="28"/>
+          <w:szCs w:val="28"/>
+        </w:rPr>
+        <w:t>Перевірка валідності даних, що стосуються Кафедри та Факультету</w:t>
+      </w:r>
+    </w:p>
+    <w:p>
+      <w:pPr>
+        <w:spacing w:after="0" w:line="240" w:lineRule="auto"/>
+        <w:rPr>
+          <w:rFonts w:ascii="Times New Roman" w:hAnsi="Times New Roman" w:cs="Times New Roman"/>
+          <w:sz w:val="28"/>
+          <w:szCs w:val="28"/>
+        </w:rPr>
+      </w:pPr>
+      <w:r>
+        <w:rPr>
+          <w:rFonts w:ascii="Times New Roman" w:hAnsi="Times New Roman" w:cs="Times New Roman"/>
+          <w:sz w:val="28"/>
+          <w:szCs w:val="28"/>
+        </w:rPr>
+        <w:t xml:space="preserve">Трухан Дар’я: </w:t>
+      </w:r>
+    </w:p>
+    <w:p>
+      <w:pPr>
+        <w:spacing w:after="0" w:line="240" w:lineRule="auto"/>
+        <w:rPr>
+          <w:rFonts w:ascii="Times New Roman" w:hAnsi="Times New Roman" w:cs="Times New Roman"/>
+          <w:sz w:val="28"/>
+          <w:szCs w:val="28"/>
+        </w:rPr>
+      </w:pPr>
+      <w:r>
+        <w:rPr>
+          <w:rFonts w:ascii="Times New Roman" w:hAnsi="Times New Roman" w:cs="Times New Roman"/>
+          <w:sz w:val="28"/>
+          <w:szCs w:val="28"/>
+        </w:rPr>
+        <w:t xml:space="preserve">Спільно: </w:t>
       </w:r>
     </w:p>
     <w:sectPr>
@@ -649,6 +1930,338 @@
     </w:sectPr>
   </w:body>
 </w:document>
+</file>
+
+<file path=word/numbering.xml><?xml version="1.0" encoding="utf-8"?>
+<w:numbering xmlns:wpc="http://schemas.microsoft.com/office/word/2010/wordprocessingCanvas" xmlns:cx="http://schemas.microsoft.com/office/drawing/2014/chartex" xmlns:cx1="http://schemas.microsoft.com/office/drawing/2015/9/8/chartex" xmlns:cx2="http://schemas.microsoft.com/office/drawing/2015/10/21/chartex" xmlns:cx3="http://schemas.microsoft.com/office/drawing/2016/5/9/chartex" xmlns:cx4="http://schemas.microsoft.com/office/drawing/2016/5/10/chartex" xmlns:cx5="http://schemas.microsoft.com/office/drawing/2016/5/11/chartex" xmlns:cx6="http://schemas.microsoft.com/office/drawing/2016/5/12/chartex" xmlns:cx7="http://schemas.microsoft.com/office/drawing/2016/5/13/chartex" xmlns:cx8="http://schemas.microsoft.com/office/drawing/2016/5/14/chartex" xmlns:mc="http://schemas.openxmlformats.org/markup-compatibility/2006" xmlns:aink="http://schemas.microsoft.com/office/drawing/2016/ink" xmlns:am3d="http://schemas.microsoft.com/office/drawing/2017/model3d" xmlns:o="urn:schemas-microsoft-com:office:office" xmlns:oel="http://schemas.microsoft.com/office/2019/extlst" xmlns:r="http://schemas.openxmlformats.org/officeDocument/2006/relationships" xmlns:m="http://schemas.openxmlformats.org/officeDocument/2006/math" xmlns:v="urn:schemas-microsoft-com:vml" xmlns:wp14="http://schemas.microsoft.com/office/word/2010/wordprocessingDrawing" xmlns:wp="http://schemas.openxmlformats.org/drawingml/2006/wordprocessingDrawing" xmlns:w10="urn:schemas-microsoft-com:office:word" xmlns:w="http://schemas.openxmlformats.org/wordprocessingml/2006/main" xmlns:w14="http://schemas.microsoft.com/office/word/2010/wordml" xmlns:w15="http://schemas.microsoft.com/office/word/2012/wordml" xmlns:w16cex="http://schemas.microsoft.com/office/word/2018/wordml/cex" xmlns:w16cid="http://schemas.microsoft.com/office/word/2016/wordml/cid" xmlns:w16="http://schemas.microsoft.com/office/word/2018/wordml" xmlns:w16du="http://schemas.microsoft.com/office/word/2023/wordml/word16du" xmlns:w16sdtdh="http://schemas.microsoft.com/office/word/2020/wordml/sdtdatahash" xmlns:w16sdtfl="http://schemas.microsoft.com/office/word/2024/wordml/sdtformatlock" xmlns:w16se="http://schemas.microsoft.com/office/word/2015/wordml/symex" xmlns:wpg="http://schemas.microsoft.com/office/word/2010/wordprocessingGroup" xmlns:wpi="http://schemas.microsoft.com/office/word/2010/wordprocessingInk" xmlns:wne="http://schemas.microsoft.com/office/word/2006/wordml" xmlns:wps="http://schemas.microsoft.com/office/word/2010/wordprocessingShape" mc:Ignorable="w14 w15 w16se w16cid w16 w16cex w16sdtdh w16sdtfl w16du wp14">
+  <w:abstractNum w:abstractNumId="0" w15:restartNumberingAfterBreak="0">
+    <w:nsid w:val="030042AD"/>
+    <w:multiLevelType w:val="multilevel"/>
+    <w:tmpl w:val="1F40323C"/>
+    <w:lvl w:ilvl="0">
+      <w:start w:val="1"/>
+      <w:numFmt w:val="decimal"/>
+      <w:lvlText w:val="%1."/>
+      <w:lvlJc w:val="left"/>
+      <w:pPr>
+        <w:tabs>
+          <w:tab w:val="num" w:pos="720"/>
+        </w:tabs>
+        <w:ind w:left="720" w:hanging="360"/>
+      </w:pPr>
+    </w:lvl>
+    <w:lvl w:ilvl="1">
+      <w:start w:val="1"/>
+      <w:numFmt w:val="bullet"/>
+      <w:lvlText w:val=""/>
+      <w:lvlJc w:val="left"/>
+      <w:pPr>
+        <w:ind w:left="1440" w:hanging="360"/>
+      </w:pPr>
+      <w:rPr>
+        <w:rFonts w:ascii="Symbol" w:hAnsi="Symbol" w:hint="default"/>
+      </w:rPr>
+    </w:lvl>
+    <w:lvl w:ilvl="2" w:tentative="1">
+      <w:start w:val="1"/>
+      <w:numFmt w:val="decimal"/>
+      <w:lvlText w:val="%3."/>
+      <w:lvlJc w:val="left"/>
+      <w:pPr>
+        <w:tabs>
+          <w:tab w:val="num" w:pos="2160"/>
+        </w:tabs>
+        <w:ind w:left="2160" w:hanging="360"/>
+      </w:pPr>
+    </w:lvl>
+    <w:lvl w:ilvl="3" w:tentative="1">
+      <w:start w:val="1"/>
+      <w:numFmt w:val="decimal"/>
+      <w:lvlText w:val="%4."/>
+      <w:lvlJc w:val="left"/>
+      <w:pPr>
+        <w:tabs>
+          <w:tab w:val="num" w:pos="2880"/>
+        </w:tabs>
+        <w:ind w:left="2880" w:hanging="360"/>
+      </w:pPr>
+    </w:lvl>
+    <w:lvl w:ilvl="4" w:tentative="1">
+      <w:start w:val="1"/>
+      <w:numFmt w:val="decimal"/>
+      <w:lvlText w:val="%5."/>
+      <w:lvlJc w:val="left"/>
+      <w:pPr>
+        <w:tabs>
+          <w:tab w:val="num" w:pos="3600"/>
+        </w:tabs>
+        <w:ind w:left="3600" w:hanging="360"/>
+      </w:pPr>
+    </w:lvl>
+    <w:lvl w:ilvl="5" w:tentative="1">
+      <w:start w:val="1"/>
+      <w:numFmt w:val="decimal"/>
+      <w:lvlText w:val="%6."/>
+      <w:lvlJc w:val="left"/>
+      <w:pPr>
+        <w:tabs>
+          <w:tab w:val="num" w:pos="4320"/>
+        </w:tabs>
+        <w:ind w:left="4320" w:hanging="360"/>
+      </w:pPr>
+    </w:lvl>
+    <w:lvl w:ilvl="6" w:tentative="1">
+      <w:start w:val="1"/>
+      <w:numFmt w:val="decimal"/>
+      <w:lvlText w:val="%7."/>
+      <w:lvlJc w:val="left"/>
+      <w:pPr>
+        <w:tabs>
+          <w:tab w:val="num" w:pos="5040"/>
+        </w:tabs>
+        <w:ind w:left="5040" w:hanging="360"/>
+      </w:pPr>
+    </w:lvl>
+    <w:lvl w:ilvl="7" w:tentative="1">
+      <w:start w:val="1"/>
+      <w:numFmt w:val="decimal"/>
+      <w:lvlText w:val="%8."/>
+      <w:lvlJc w:val="left"/>
+      <w:pPr>
+        <w:tabs>
+          <w:tab w:val="num" w:pos="5760"/>
+        </w:tabs>
+        <w:ind w:left="5760" w:hanging="360"/>
+      </w:pPr>
+    </w:lvl>
+    <w:lvl w:ilvl="8" w:tentative="1">
+      <w:start w:val="1"/>
+      <w:numFmt w:val="decimal"/>
+      <w:lvlText w:val="%9."/>
+      <w:lvlJc w:val="left"/>
+      <w:pPr>
+        <w:tabs>
+          <w:tab w:val="num" w:pos="6480"/>
+        </w:tabs>
+        <w:ind w:left="6480" w:hanging="360"/>
+      </w:pPr>
+    </w:lvl>
+  </w:abstractNum>
+  <w:abstractNum w:abstractNumId="1" w15:restartNumberingAfterBreak="0">
+    <w:nsid w:val="133807CA"/>
+    <w:multiLevelType w:val="hybridMultilevel"/>
+    <w:tmpl w:val="01E0550E"/>
+    <w:lvl w:ilvl="0" w:tplc="0422000F">
+      <w:start w:val="1"/>
+      <w:numFmt w:val="decimal"/>
+      <w:lvlText w:val="%1."/>
+      <w:lvlJc w:val="left"/>
+      <w:pPr>
+        <w:ind w:left="720" w:hanging="360"/>
+      </w:pPr>
+      <w:rPr>
+        <w:rFonts w:hint="default"/>
+      </w:rPr>
+    </w:lvl>
+    <w:lvl w:ilvl="1" w:tplc="04220001">
+      <w:start w:val="1"/>
+      <w:numFmt w:val="bullet"/>
+      <w:lvlText w:val=""/>
+      <w:lvlJc w:val="left"/>
+      <w:pPr>
+        <w:ind w:left="1440" w:hanging="360"/>
+      </w:pPr>
+      <w:rPr>
+        <w:rFonts w:ascii="Symbol" w:hAnsi="Symbol" w:hint="default"/>
+      </w:rPr>
+    </w:lvl>
+    <w:lvl w:ilvl="2" w:tplc="0422001B" w:tentative="1">
+      <w:start w:val="1"/>
+      <w:numFmt w:val="lowerRoman"/>
+      <w:lvlText w:val="%3."/>
+      <w:lvlJc w:val="right"/>
+      <w:pPr>
+        <w:ind w:left="2160" w:hanging="180"/>
+      </w:pPr>
+    </w:lvl>
+    <w:lvl w:ilvl="3" w:tplc="0422000F" w:tentative="1">
+      <w:start w:val="1"/>
+      <w:numFmt w:val="decimal"/>
+      <w:lvlText w:val="%4."/>
+      <w:lvlJc w:val="left"/>
+      <w:pPr>
+        <w:ind w:left="2880" w:hanging="360"/>
+      </w:pPr>
+    </w:lvl>
+    <w:lvl w:ilvl="4" w:tplc="04220019" w:tentative="1">
+      <w:start w:val="1"/>
+      <w:numFmt w:val="lowerLetter"/>
+      <w:lvlText w:val="%5."/>
+      <w:lvlJc w:val="left"/>
+      <w:pPr>
+        <w:ind w:left="3600" w:hanging="360"/>
+      </w:pPr>
+    </w:lvl>
+    <w:lvl w:ilvl="5" w:tplc="0422001B" w:tentative="1">
+      <w:start w:val="1"/>
+      <w:numFmt w:val="lowerRoman"/>
+      <w:lvlText w:val="%6."/>
+      <w:lvlJc w:val="right"/>
+      <w:pPr>
+        <w:ind w:left="4320" w:hanging="180"/>
+      </w:pPr>
+    </w:lvl>
+    <w:lvl w:ilvl="6" w:tplc="0422000F" w:tentative="1">
+      <w:start w:val="1"/>
+      <w:numFmt w:val="decimal"/>
+      <w:lvlText w:val="%7."/>
+      <w:lvlJc w:val="left"/>
+      <w:pPr>
+        <w:ind w:left="5040" w:hanging="360"/>
+      </w:pPr>
+    </w:lvl>
+    <w:lvl w:ilvl="7" w:tplc="04220019" w:tentative="1">
+      <w:start w:val="1"/>
+      <w:numFmt w:val="lowerLetter"/>
+      <w:lvlText w:val="%8."/>
+      <w:lvlJc w:val="left"/>
+      <w:pPr>
+        <w:ind w:left="5760" w:hanging="360"/>
+      </w:pPr>
+    </w:lvl>
+    <w:lvl w:ilvl="8" w:tplc="0422001B" w:tentative="1">
+      <w:start w:val="1"/>
+      <w:numFmt w:val="lowerRoman"/>
+      <w:lvlText w:val="%9."/>
+      <w:lvlJc w:val="right"/>
+      <w:pPr>
+        <w:ind w:left="6480" w:hanging="180"/>
+      </w:pPr>
+    </w:lvl>
+  </w:abstractNum>
+  <w:abstractNum w:abstractNumId="2" w15:restartNumberingAfterBreak="0">
+    <w:nsid w:val="1DE457E2"/>
+    <w:multiLevelType w:val="hybridMultilevel"/>
+    <w:tmpl w:val="822065C6"/>
+    <w:lvl w:ilvl="0" w:tplc="04220001">
+      <w:start w:val="1"/>
+      <w:numFmt w:val="bullet"/>
+      <w:lvlText w:val=""/>
+      <w:lvlJc w:val="left"/>
+      <w:pPr>
+        <w:ind w:left="1440" w:hanging="360"/>
+      </w:pPr>
+      <w:rPr>
+        <w:rFonts w:ascii="Symbol" w:hAnsi="Symbol" w:hint="default"/>
+      </w:rPr>
+    </w:lvl>
+    <w:lvl w:ilvl="1" w:tplc="04220003" w:tentative="1">
+      <w:start w:val="1"/>
+      <w:numFmt w:val="bullet"/>
+      <w:lvlText w:val="o"/>
+      <w:lvlJc w:val="left"/>
+      <w:pPr>
+        <w:ind w:left="2160" w:hanging="360"/>
+      </w:pPr>
+      <w:rPr>
+        <w:rFonts w:ascii="Courier New" w:hAnsi="Courier New" w:cs="Courier New" w:hint="default"/>
+      </w:rPr>
+    </w:lvl>
+    <w:lvl w:ilvl="2" w:tplc="04220005" w:tentative="1">
+      <w:start w:val="1"/>
+      <w:numFmt w:val="bullet"/>
+      <w:lvlText w:val=""/>
+      <w:lvlJc w:val="left"/>
+      <w:pPr>
+        <w:ind w:left="2880" w:hanging="360"/>
+      </w:pPr>
+      <w:rPr>
+        <w:rFonts w:ascii="Wingdings" w:hAnsi="Wingdings" w:hint="default"/>
+      </w:rPr>
+    </w:lvl>
+    <w:lvl w:ilvl="3" w:tplc="04220001" w:tentative="1">
+      <w:start w:val="1"/>
+      <w:numFmt w:val="bullet"/>
+      <w:lvlText w:val=""/>
+      <w:lvlJc w:val="left"/>
+      <w:pPr>
+        <w:ind w:left="3600" w:hanging="360"/>
+      </w:pPr>
+      <w:rPr>
+        <w:rFonts w:ascii="Symbol" w:hAnsi="Symbol" w:hint="default"/>
+      </w:rPr>
+    </w:lvl>
+    <w:lvl w:ilvl="4" w:tplc="04220003" w:tentative="1">
+      <w:start w:val="1"/>
+      <w:numFmt w:val="bullet"/>
+      <w:lvlText w:val="o"/>
+      <w:lvlJc w:val="left"/>
+      <w:pPr>
+        <w:ind w:left="4320" w:hanging="360"/>
+      </w:pPr>
+      <w:rPr>
+        <w:rFonts w:ascii="Courier New" w:hAnsi="Courier New" w:cs="Courier New" w:hint="default"/>
+      </w:rPr>
+    </w:lvl>
+    <w:lvl w:ilvl="5" w:tplc="04220005" w:tentative="1">
+      <w:start w:val="1"/>
+      <w:numFmt w:val="bullet"/>
+      <w:lvlText w:val=""/>
+      <w:lvlJc w:val="left"/>
+      <w:pPr>
+        <w:ind w:left="5040" w:hanging="360"/>
+      </w:pPr>
+      <w:rPr>
+        <w:rFonts w:ascii="Wingdings" w:hAnsi="Wingdings" w:hint="default"/>
+      </w:rPr>
+    </w:lvl>
+    <w:lvl w:ilvl="6" w:tplc="04220001" w:tentative="1">
+      <w:start w:val="1"/>
+      <w:numFmt w:val="bullet"/>
+      <w:lvlText w:val=""/>
+      <w:lvlJc w:val="left"/>
+      <w:pPr>
+        <w:ind w:left="5760" w:hanging="360"/>
+      </w:pPr>
+      <w:rPr>
+        <w:rFonts w:ascii="Symbol" w:hAnsi="Symbol" w:hint="default"/>
+      </w:rPr>
+    </w:lvl>
+    <w:lvl w:ilvl="7" w:tplc="04220003" w:tentative="1">
+      <w:start w:val="1"/>
+      <w:numFmt w:val="bullet"/>
+      <w:lvlText w:val="o"/>
+      <w:lvlJc w:val="left"/>
+      <w:pPr>
+        <w:ind w:left="6480" w:hanging="360"/>
+      </w:pPr>
+      <w:rPr>
+        <w:rFonts w:ascii="Courier New" w:hAnsi="Courier New" w:cs="Courier New" w:hint="default"/>
+      </w:rPr>
+    </w:lvl>
+    <w:lvl w:ilvl="8" w:tplc="04220005" w:tentative="1">
+      <w:start w:val="1"/>
+      <w:numFmt w:val="bullet"/>
+      <w:lvlText w:val=""/>
+      <w:lvlJc w:val="left"/>
+      <w:pPr>
+        <w:ind w:left="7200" w:hanging="360"/>
+      </w:pPr>
+      <w:rPr>
+        <w:rFonts w:ascii="Wingdings" w:hAnsi="Wingdings" w:hint="default"/>
+      </w:rPr>
+    </w:lvl>
+  </w:abstractNum>
+  <w:num w:numId="1" w16cid:durableId="920262297">
+    <w:abstractNumId w:val="0"/>
+  </w:num>
+  <w:num w:numId="2" w16cid:durableId="598953078">
+    <w:abstractNumId w:val="2"/>
+  </w:num>
+  <w:num w:numId="3" w16cid:durableId="758252360">
+    <w:abstractNumId w:val="1"/>
+  </w:num>
+</w:numbering>
 </file>
 
 <file path=word/styles.xml><?xml version="1.0" encoding="utf-8"?>
@@ -1254,7 +2867,6 @@
   <w:style w:type="character" w:default="1" w:styleId="a0">
     <w:name w:val="Default Paragraph Font"/>
     <w:uiPriority w:val="1"/>
-    <w:semiHidden/>
     <w:unhideWhenUsed/>
   </w:style>
   <w:style w:type="table" w:default="1" w:styleId="a1">

</xml_diff>